<commit_message>
Projede bug temizliği yapıldı.
</commit_message>
<xml_diff>
--- a/stajdefterdoldurma_doldurulmus.docx
+++ b/stajdefterdoldurma_doldurulmus.docx
@@ -221,7 +221,7 @@
                 <w:color w:val="1F2A37"/>
                 <w:sz w:val="21"/>
               </w:rPr>
-              <w:t>24 Haziran – 5 Ağustos 2026 (6 hafta / 30 iş günü, hafta sonları hariç)</w:t>
+              <w:t>24 Haziran – 4 Ağustos 2026 (6 hafta / 30 iş günü, hafta sonları hariç)</w:t>
             </w:r>
           </w:p>
         </w:tc>
@@ -2524,7 +2524,7 @@
                 <w:color w:val="1F2A37"/>
                 <w:sz w:val="21"/>
               </w:rPr>
-              <w:t>RAG hattının uçtan uca cevap kalitesi manuel olarak test edildi. Örnek yönetmelik dokümanları üzerinden sorulan sorularda modelin, doğru kaynaklara dayalı ve tutarlı cevaplar ürettiği gözlemlendi. Bağlam penceresiyle ilgili .env ayarları gözden geçirilerek getirilen chunk sayısı ile model penceresi arasındaki denge optimize edildi. Vektör veritabanı ile ilişkisel veritabanı arasındaki sıralama ve karar mekanizması (önce PostgreSQL üzerinden doğrulama, ardından ChromaDB sonuçlarının filtrelenmesi) gözden geçirilerek tutarlılık pekiştirildi. Dokümanda bulunmayan sorularda standart yanıtın döndüğü, bulunan sorularda ise kaynak gösteriminin eksiksiz çalıştığı örnek senaryolarla doğrulandı.</w:t>
+              <w:t>RAG hattının uçtan uca cevap kalitesi manuel olarak test edildi. Örnek yönetmelik dokümanları üzerinden sorulan sorularda modelin, doğru kaynaklara dayalı ve tutarlı cevaplar ürettiği gözlemlendi. Bağlam penceresiyle ilgili .env ayarları gözden geçirilerek getirilen chunk sayısı ile model penceresi arasındaki denge optimize edildi. Vektör veritabanı ile ilişkisel veritabanı arasındaki sıralama ve karar mekanizması (önce PostgreSQL üzerinden doğrulama, ardından ChromaDB sonuçlarının filtrelenmesi) gözden geçirilerek tutarlılık pekiştirildi. Dokümanda bulunmayan sorularda standart yanıtın döndüğü, bulunan sorularda ise kaynak gösteriminin eksiksiz çalıştığı örnek senaryolarla doğrulandı. Ayrıca dokümandan bağımsız genel sohbet modu geliştirildi: backend'de /chat/general endpoint'i ile izinli modelleri listeleyen GET /chat/models ucu, arayüzde ise general-chat.tsx sayfası eklendi. Birden fazla lokal modelin tanımlanıp kullanıcıya seçtirilebilmesi için sunucu tarafında allowlist temelli bir model kayıt yapısı (model_registry.py, LLM_ALLOWED_MODELS) ve arayüzde ModelSelector bileşeni yazıldı; istemciden yalnızca model kimliği kabul edilip üretim parametrelerinin (context window, max_tokens, temperature) sunucu tanımlarından gelmesi sağlanarak parametre manipülasyonunun önüne geçildi.</w:t>
             </w:r>
           </w:p>
         </w:tc>
@@ -2971,7 +2971,7 @@
                 <w:color w:val="1F2A37"/>
                 <w:sz w:val="21"/>
               </w:rPr>
-              <w:t>Frontend arayüzü profesyonel bir yapıya kavuşturuldu. Ortak sayfa düzeni için AuthLayout ve üst gezinme için Header bileşenleri oluşturuldu. Tekrar eden stil tanımları lib/ui.ts altında toplanarak bileşenler arasında tutarlı bir görünüm sağlandı. FileUploader, DocumentList, ChatBox, SourcePanel ve StatusBadge bileşenleri gözden geçirilerek yeniden düzenlendi. Sayfalar (index, login, register, upload, documents, chat, admin) tutarlı bir tasarım diline göre revize edildi. Onay gerektiren işlemler için ConfirmDialog ve yükleme durumları için Spinner bileşeni eklenerek kullanıcı etkileşimleri iyileştirildi. Yapılan bu düzenlemelerle kod tekrarının azaldığı ve bakımın kolaylaştığı gözlemlendi.</w:t>
+              <w:t>Frontend arayüzü profesyonel bir yapıya kavuşturuldu. Ortak sayfa düzeni için AuthLayout ve üst gezinme için Header bileşenleri oluşturuldu. Tekrar eden stil tanımları lib/ui.ts altında toplanarak bileşenler arasında tutarlı bir görünüm sağlandı. FileUploader, DocumentList, ChatBox, SourcePanel ve StatusBadge bileşenleri gözden geçirilerek yeniden düzenlendi. Sayfalar (index, login, register, upload, documents, chat, admin) tutarlı bir tasarım diline göre revize edildi. Onay gerektiren işlemler için ConfirmDialog ve yükleme durumları için Spinner bileşeni eklenerek kullanıcı etkileşimleri iyileştirildi. Sayfa ve liste öğelerinin yumuşak giriş animasyonlarıyla görünmesi için Reveal bileşeni eklendi; hareket azaltma tercihi (prefers-reduced-motion) bulunan kullanıcılarda animasyonların otomatik olarak devre dışı kalması useReducedMotion kancasıyla sağlandı. Yapılan bu düzenlemelerle kod tekrarının azaldığı ve bakımın kolaylaştığı gözlemlendi.</w:t>
             </w:r>
           </w:p>
         </w:tc>
@@ -3057,7 +3057,7 @@
                 <w:color w:val="1F2A37"/>
                 <w:sz w:val="21"/>
               </w:rPr>
-              <w:t>Kullanıcı dostu hata yönetimi ve arayüz cilası üzerine çalışıldı. 401 (giriş gerekli), 403 (yetki yok), pasif hesap ve lokal LLM kapalı gibi durumlar için anlaşılır Türkçe hata mesajları eklendi. Var olmayan adresler için 404.tsx 'Sayfa bulunamadı' sayfası oluşturuldu. Yükleme ve işleme durumu göstergeleri iyileştirilerek kullanıcının dokümanın hangi aşamada olduğunu görebilmesi sağlandı. Arayüzün farklı ekran boyutlarında düzgün görüntülenmesi için responsive düzen gözden geçirildi. Yetkisiz sayfalara erişimde kullanıcının giriş ekranına yönlendirildiği doğrulandı ve tüm ana akışların (giriş, kayıt, yükleme, sohbet, admin) sorunsuz çalıştığı test edildi.</w:t>
+              <w:t>Kullanıcı dostu hata yönetimi ve arayüz cilası üzerine çalışıldı. 401 (giriş gerekli), 403 (yetki yok), pasif hesap ve lokal LLM kapalı gibi durumlar için anlaşılır Türkçe hata mesajları eklendi. Var olmayan adresler için 404.tsx 'Sayfa bulunamadı' sayfası oluşturuldu. Yükleme ve işleme durumu göstergeleri iyileştirilerek kullanıcının dokümanın hangi aşamada olduğunu görebilmesi sağlandı. Arayüzün farklı ekran boyutlarında düzgün görüntülenmesi için responsive düzen gözden geçirildi. Yetkisiz sayfalara erişimde kullanıcının giriş ekranına yönlendirildiği doğrulandı ve tüm ana akışların (giriş, kayıt, yükleme, sohbet, admin) sorunsuz çalıştığı test edildi. Ayrıca sohbet geçmişinin sayfa yenilemelerinde kaybolmaması için RAG ve genel sohbet ekranlarının ortak kullandığı localStorage tabanlı bir geçmiş katmanı (chatHistory.ts) eklendi; okunan kayıtların şema doğrulamasından geçirilmesiyle bozuk verinin sohbet ekranını açılışta çökertmesi engellendi.</w:t>
             </w:r>
           </w:p>
         </w:tc>
@@ -3504,7 +3504,7 @@
                 <w:color w:val="1F2A37"/>
                 <w:sz w:val="21"/>
               </w:rPr>
-              <w:t>Arayüz iyileştirmeleri ve değerlendirme çalışmaları yapıldı. Frontend'e açık/koyu tema desteği için ThemeToggle bileşeni ve useTheme kancası eklenerek tema tercihinin kullanıcı bazında değiştirilebilmesi sağlandı. Değerlendirme tarafında evaluation/ground_truth.json içindeki pozitif ve negatif sorulardan oluşan test seti kullanılarak retrieval metrikleri ölçüldü; evaluation/run_eval.py ile Recall@5 ve MRR, run_answer_eval.py ile Source Accuracy ve No Hallucination Rate hesaplandı. Ölçümlerde hedeflenen eşiklerin (Recall ≥ %70, MRR ≥ 0.50) karşılandığı gözlemlendi. Negatif sorularda modelin standart 'bulunamadı' yanıtını döndürerek bilgi uydurmadığı doğrulandı. Elde edilen metriklerin evaluation/results.json dosyasına yazılarak raporlanabilir hale getirildiği ve sonuçların proje hedefleriyle uyumlu olduğu değerlendirildi.</w:t>
+              <w:t>Arayüz iyileştirmeleri ve değerlendirme çalışmaları yapıldı. Frontend'e açık/koyu tema desteği için ThemeToggle bileşeni ve useTheme kancası eklenerek tema tercihinin kullanıcı bazında değiştirilebilmesi sağlandı. Değerlendirme tarafında evaluation/ground_truth.json içindeki pozitif ve negatif sorulardan oluşan test seti kullanılarak retrieval metrikleri ölçüldü; evaluation/run_eval.py ile Recall@5 ve MRR, run_answer_eval.py ile Source Accuracy ve No Hallucination Rate hesaplandı. Ölçümlerde hedeflenen eşiklerin (Recall ≥ %70, MRR ≥ 0.50) karşılandığı gözlemlendi (Recall@5 = 0.80, MRR = 0.68). Negatif sorularda modelin standart 'bulunamadı' yanıtını döndürerek bilgi uydurmadığı doğrulandı (No Hallucination Rate = 1.00). Elde edilen metriklerin evaluation/results.json dosyasına yazılarak raporlanabilir hale getirildiği ve sonuçların proje hedefleriyle uyumlu olduğu değerlendirildi.</w:t>
             </w:r>
           </w:p>
         </w:tc>

</xml_diff>